<commit_message>
test(backend): cover every playbook rule in the sample redlines
</commit_message>
<xml_diff>
--- a/backend/data/samples/NSO-417_CTA_Site21_payment_redline.docx
+++ b/backend/data/samples/NSO-417_CTA_Site21_payment_redline.docx
@@ -571,6 +571,58 @@
     </w:p>
     <w:p>
       <w:pPr>
+        <w:pStyle w:val="Heading2"/>
+      </w:pPr>
+      <w:r>
+        <w:t xml:space="preserve">§6.8 Indirect Costs</w:t>
+      </w:r>
+    </w:p>
+    <w:p>
+      <w:r>
+        <w:t xml:space="preserve">Sponsor shall pay Institution’s indirect costs at </w:t>
+      </w:r>
+      <w:del w:id="14" w:author="K. Okafor (Site 21)" w:date="2026-10-16T13:20:00Z">
+        <w:r>
+          <w:delText xml:space="preserve">twenty-five percent (25%)</w:delText>
+        </w:r>
+      </w:del>
+      <w:ins w:id="15" w:author="K. Okafor (Site 21)" w:date="2026-10-16T13:20:00Z">
+        <w:r>
+          <w:t xml:space="preserve">twenty-eight percent (28%)</w:t>
+        </w:r>
+      </w:ins>
+      <w:r>
+        <w:t xml:space="preserve"> of direct costs.</w:t>
+      </w:r>
+    </w:p>
+    <w:p>
+      <w:pPr>
+        <w:pStyle w:val="Heading2"/>
+      </w:pPr>
+      <w:r>
+        <w:t xml:space="preserve">§6.9 Screen Failures</w:t>
+      </w:r>
+    </w:p>
+    <w:p>
+      <w:r>
+        <w:t xml:space="preserve">Sponsor shall reimburse screen failures at the screening-visit amount</w:t>
+      </w:r>
+      <w:del w:id="16" w:author="K. Okafor (Site 21)" w:date="2026-10-16T13:20:00Z">
+        <w:r>
+          <w:delText xml:space="preserve">, up to one (1) screen failure for every three (3) Study Subjects enrolled</w:delText>
+        </w:r>
+      </w:del>
+      <w:ins w:id="17" w:author="K. Okafor (Site 21)" w:date="2026-10-16T13:20:00Z">
+        <w:r>
+          <w:t xml:space="preserve">, without limit</w:t>
+        </w:r>
+      </w:ins>
+      <w:r>
+        <w:t xml:space="preserve">.</w:t>
+      </w:r>
+    </w:p>
+    <w:p>
+      <w:pPr>
         <w:pStyle w:val="Heading1"/>
       </w:pPr>
       <w:r>
@@ -1039,12 +1091,12 @@
       <w:r>
         <w:t xml:space="preserve">Institution may terminate this Agreement on </w:t>
       </w:r>
-      <w:del w:id="14" w:author="K. Okafor (Site 21)" w:date="2026-10-16T13:20:00Z">
+      <w:del w:id="18" w:author="K. Okafor (Site 21)" w:date="2026-10-16T13:20:00Z">
         <w:r>
           <w:delText xml:space="preserve">thirty (30)</w:delText>
         </w:r>
       </w:del>
-      <w:ins w:id="15" w:author="K. Okafor (Site 21)" w:date="2026-10-16T13:20:00Z">
+      <w:ins w:id="19" w:author="K. Okafor (Site 21)" w:date="2026-10-16T13:20:00Z">
         <w:r>
           <w:t xml:space="preserve">forty-five (45)</w:t>
         </w:r>

</xml_diff>